<commit_message>
UP 2 HALLELUJAH AMEN
</commit_message>
<xml_diff>
--- a/32UP Upravlinnja projektamy/2/KNT-122_Onyshchenko_Variant-19_PR2.docx
+++ b/32UP Upravlinnja projektamy/2/KNT-122_Onyshchenko_Variant-19_PR2.docx
@@ -521,26 +521,654 @@
     </w:p>
     <w:p>
       <w:pPr>
-        <w:pStyle w:val="P"/>
-        <w:rPr>
-          <w:lang w:val="en-US"/>
-        </w:rPr>
-      </w:pPr>
-    </w:p>
-    <w:p>
-      <w:pPr>
-        <w:pStyle w:val="P"/>
-        <w:rPr>
-          <w:lang w:val="en-US"/>
-        </w:rPr>
-      </w:pPr>
-    </w:p>
-    <w:p>
-      <w:pPr>
-        <w:pStyle w:val="P"/>
-        <w:rPr>
-          <w:lang w:val="en-US"/>
-        </w:rPr>
+        <w:pStyle w:val="H2"/>
+      </w:pPr>
+      <w:r>
+        <w:t xml:space="preserve">1 Реєстрації у </w:t>
+      </w:r>
+      <w:r>
+        <w:rPr>
+          <w:lang w:val="en-US"/>
+        </w:rPr>
+        <w:t>Toggl</w:t>
+      </w:r>
+    </w:p>
+    <w:p>
+      <w:pPr>
+        <w:pStyle w:val="P"/>
+      </w:pPr>
+    </w:p>
+    <w:p>
+      <w:pPr>
+        <w:pStyle w:val="P"/>
+        <w:rPr>
+          <w:lang w:val="en-US"/>
+        </w:rPr>
+      </w:pPr>
+      <w:r>
+        <w:t xml:space="preserve">Для реєстрації було перейдено на сайт </w:t>
+      </w:r>
+      <w:hyperlink r:id="rId6" w:history="1">
+        <w:r>
+          <w:rPr>
+            <w:rStyle w:val="a4"/>
+          </w:rPr>
+          <w:t>https://toggl.com</w:t>
+        </w:r>
+      </w:hyperlink>
+      <w:r>
+        <w:t xml:space="preserve">, здійснено вхід за акаунтом </w:t>
+      </w:r>
+      <w:r>
+        <w:rPr>
+          <w:lang w:val="en-US"/>
+        </w:rPr>
+        <w:t xml:space="preserve">Google </w:t>
+      </w:r>
+      <w:r>
+        <w:t xml:space="preserve">та пройдено вступне опитування. </w:t>
+      </w:r>
+    </w:p>
+    <w:p>
+      <w:pPr>
+        <w:pStyle w:val="P"/>
+        <w:rPr>
+          <w:lang w:val="en-US"/>
+        </w:rPr>
+      </w:pPr>
+    </w:p>
+    <w:p>
+      <w:pPr>
+        <w:pStyle w:val="IMG"/>
+        <w:rPr>
+          <w:lang w:val="en-US"/>
+        </w:rPr>
+      </w:pPr>
+      <w:r>
+        <w:rPr>
+          <w:lang w:val="en-US"/>
+        </w:rPr>
+        <w:lastRenderedPageBreak/>
+        <w:drawing>
+          <wp:inline distT="0" distB="0" distL="0" distR="0" wp14:anchorId="125F969A" wp14:editId="49034581">
+            <wp:extent cx="5731510" cy="5953760"/>
+            <wp:effectExtent l="0" t="0" r="2540" b="8890"/>
+            <wp:docPr id="1552769242" name="Рисунок 1" descr="Зображення, що містить текст, знімок екрана, програмне забезпечення, Веб-сайт&#10;&#10;Вміст, створений ШІ, може бути неправильним."/>
+            <wp:cNvGraphicFramePr>
+              <a:graphicFrameLocks xmlns:a="http://schemas.openxmlformats.org/drawingml/2006/main" noChangeAspect="1"/>
+            </wp:cNvGraphicFramePr>
+            <a:graphic xmlns:a="http://schemas.openxmlformats.org/drawingml/2006/main">
+              <a:graphicData uri="http://schemas.openxmlformats.org/drawingml/2006/picture">
+                <pic:pic xmlns:pic="http://schemas.openxmlformats.org/drawingml/2006/picture">
+                  <pic:nvPicPr>
+                    <pic:cNvPr id="1552769242" name="Рисунок 1" descr="Зображення, що містить текст, знімок екрана, програмне забезпечення, Веб-сайт&#10;&#10;Вміст, створений ШІ, може бути неправильним."/>
+                    <pic:cNvPicPr/>
+                  </pic:nvPicPr>
+                  <pic:blipFill>
+                    <a:blip r:embed="rId7"/>
+                    <a:stretch>
+                      <a:fillRect/>
+                    </a:stretch>
+                  </pic:blipFill>
+                  <pic:spPr>
+                    <a:xfrm>
+                      <a:off x="0" y="0"/>
+                      <a:ext cx="5731510" cy="5953760"/>
+                    </a:xfrm>
+                    <a:prstGeom prst="rect">
+                      <a:avLst/>
+                    </a:prstGeom>
+                  </pic:spPr>
+                </pic:pic>
+              </a:graphicData>
+            </a:graphic>
+          </wp:inline>
+        </w:drawing>
+      </w:r>
+    </w:p>
+    <w:p>
+      <w:pPr>
+        <w:pStyle w:val="IMG"/>
+      </w:pPr>
+      <w:r>
+        <w:t>Рисунок 1.</w:t>
+      </w:r>
+      <w:r>
+        <w:t>1</w:t>
+      </w:r>
+      <w:r>
+        <w:t xml:space="preserve"> – Сайт </w:t>
+      </w:r>
+      <w:r>
+        <w:rPr>
+          <w:lang w:val="en-US"/>
+        </w:rPr>
+        <w:t xml:space="preserve">Toggl, </w:t>
+      </w:r>
+      <w:r>
+        <w:t>натискання кнопки реєстрації (</w:t>
+      </w:r>
+      <w:r>
+        <w:rPr>
+          <w:lang w:val="en-US"/>
+        </w:rPr>
+        <w:t>Start tracking for free)</w:t>
+      </w:r>
+    </w:p>
+    <w:p>
+      <w:pPr>
+        <w:pStyle w:val="IMG"/>
+        <w:rPr>
+          <w:lang w:val="en-US"/>
+        </w:rPr>
+      </w:pPr>
+    </w:p>
+    <w:p>
+      <w:pPr>
+        <w:pStyle w:val="IMG"/>
+        <w:rPr>
+          <w:lang w:val="en-US"/>
+        </w:rPr>
+      </w:pPr>
+      <w:r>
+        <w:rPr>
+          <w:lang w:val="en-US"/>
+        </w:rPr>
+        <w:lastRenderedPageBreak/>
+        <w:drawing>
+          <wp:inline distT="0" distB="0" distL="0" distR="0" wp14:anchorId="3B234E3B" wp14:editId="79117AB0">
+            <wp:extent cx="5731510" cy="3564255"/>
+            <wp:effectExtent l="0" t="0" r="2540" b="0"/>
+            <wp:docPr id="1391523959" name="Рисунок 1" descr="Зображення, що містить текст, знімок екрана, Шрифт, дизайн&#10;&#10;Вміст, створений ШІ, може бути неправильним."/>
+            <wp:cNvGraphicFramePr>
+              <a:graphicFrameLocks xmlns:a="http://schemas.openxmlformats.org/drawingml/2006/main" noChangeAspect="1"/>
+            </wp:cNvGraphicFramePr>
+            <a:graphic xmlns:a="http://schemas.openxmlformats.org/drawingml/2006/main">
+              <a:graphicData uri="http://schemas.openxmlformats.org/drawingml/2006/picture">
+                <pic:pic xmlns:pic="http://schemas.openxmlformats.org/drawingml/2006/picture">
+                  <pic:nvPicPr>
+                    <pic:cNvPr id="1391523959" name="Рисунок 1" descr="Зображення, що містить текст, знімок екрана, Шрифт, дизайн&#10;&#10;Вміст, створений ШІ, може бути неправильним."/>
+                    <pic:cNvPicPr/>
+                  </pic:nvPicPr>
+                  <pic:blipFill>
+                    <a:blip r:embed="rId8"/>
+                    <a:stretch>
+                      <a:fillRect/>
+                    </a:stretch>
+                  </pic:blipFill>
+                  <pic:spPr>
+                    <a:xfrm>
+                      <a:off x="0" y="0"/>
+                      <a:ext cx="5731510" cy="3564255"/>
+                    </a:xfrm>
+                    <a:prstGeom prst="rect">
+                      <a:avLst/>
+                    </a:prstGeom>
+                  </pic:spPr>
+                </pic:pic>
+              </a:graphicData>
+            </a:graphic>
+          </wp:inline>
+        </w:drawing>
+      </w:r>
+    </w:p>
+    <w:p>
+      <w:pPr>
+        <w:pStyle w:val="IMG"/>
+        <w:rPr>
+          <w:lang w:val="en-US"/>
+        </w:rPr>
+      </w:pPr>
+      <w:r>
+        <w:t>Рисунок 1.</w:t>
+      </w:r>
+      <w:r>
+        <w:rPr>
+          <w:lang w:val="en-US"/>
+        </w:rPr>
+        <w:t>2</w:t>
+      </w:r>
+      <w:r>
+        <w:t xml:space="preserve"> – </w:t>
+      </w:r>
+      <w:r>
+        <w:t>Авторизація</w:t>
+      </w:r>
+      <w:r>
+        <w:t xml:space="preserve"> в системі через </w:t>
+      </w:r>
+      <w:r>
+        <w:rPr>
+          <w:lang w:val="en-US"/>
+        </w:rPr>
+        <w:t>Google</w:t>
+      </w:r>
+    </w:p>
+    <w:p>
+      <w:pPr>
+        <w:pStyle w:val="P"/>
+        <w:rPr>
+          <w:lang w:val="en-US"/>
+        </w:rPr>
+      </w:pPr>
+    </w:p>
+    <w:p>
+      <w:pPr>
+        <w:pStyle w:val="P"/>
+        <w:rPr>
+          <w:lang w:val="en-US"/>
+        </w:rPr>
+      </w:pPr>
+      <w:r>
+        <w:t>Після</w:t>
+      </w:r>
+      <w:r>
+        <w:t xml:space="preserve"> виконання</w:t>
+      </w:r>
+      <w:r>
+        <w:t xml:space="preserve"> цих кроків сайт має </w:t>
+      </w:r>
+      <w:r>
+        <w:t xml:space="preserve">такий </w:t>
+      </w:r>
+      <w:r>
+        <w:t>вигляд:</w:t>
+      </w:r>
+    </w:p>
+    <w:p>
+      <w:pPr>
+        <w:pStyle w:val="P"/>
+      </w:pPr>
+    </w:p>
+    <w:p>
+      <w:pPr>
+        <w:pStyle w:val="IMG"/>
+      </w:pPr>
+      <w:r>
+        <w:lastRenderedPageBreak/>
+        <w:drawing>
+          <wp:inline distT="0" distB="0" distL="0" distR="0" wp14:anchorId="7E309515" wp14:editId="7962957F">
+            <wp:extent cx="5731510" cy="6532880"/>
+            <wp:effectExtent l="0" t="0" r="2540" b="1270"/>
+            <wp:docPr id="1047240281" name="Рисунок 1" descr="Зображення, що містить текст, знімок екрана, число, програмне забезпечення&#10;&#10;Вміст, створений ШІ, може бути неправильним."/>
+            <wp:cNvGraphicFramePr>
+              <a:graphicFrameLocks xmlns:a="http://schemas.openxmlformats.org/drawingml/2006/main" noChangeAspect="1"/>
+            </wp:cNvGraphicFramePr>
+            <a:graphic xmlns:a="http://schemas.openxmlformats.org/drawingml/2006/main">
+              <a:graphicData uri="http://schemas.openxmlformats.org/drawingml/2006/picture">
+                <pic:pic xmlns:pic="http://schemas.openxmlformats.org/drawingml/2006/picture">
+                  <pic:nvPicPr>
+                    <pic:cNvPr id="1047240281" name="Рисунок 1" descr="Зображення, що містить текст, знімок екрана, число, програмне забезпечення&#10;&#10;Вміст, створений ШІ, може бути неправильним."/>
+                    <pic:cNvPicPr/>
+                  </pic:nvPicPr>
+                  <pic:blipFill>
+                    <a:blip r:embed="rId9"/>
+                    <a:stretch>
+                      <a:fillRect/>
+                    </a:stretch>
+                  </pic:blipFill>
+                  <pic:spPr>
+                    <a:xfrm>
+                      <a:off x="0" y="0"/>
+                      <a:ext cx="5731510" cy="6532880"/>
+                    </a:xfrm>
+                    <a:prstGeom prst="rect">
+                      <a:avLst/>
+                    </a:prstGeom>
+                  </pic:spPr>
+                </pic:pic>
+              </a:graphicData>
+            </a:graphic>
+          </wp:inline>
+        </w:drawing>
+      </w:r>
+    </w:p>
+    <w:p>
+      <w:pPr>
+        <w:pStyle w:val="IMG"/>
+      </w:pPr>
+      <w:r>
+        <w:t>Рисунок 1.</w:t>
+      </w:r>
+      <w:r>
+        <w:t>3</w:t>
+      </w:r>
+      <w:r>
+        <w:t xml:space="preserve"> – Вигляд </w:t>
+      </w:r>
+      <w:r>
+        <w:t>сайту</w:t>
+      </w:r>
+      <w:r>
+        <w:t xml:space="preserve"> </w:t>
+      </w:r>
+      <w:r>
+        <w:rPr>
+          <w:lang w:val="en-US"/>
+        </w:rPr>
+        <w:t xml:space="preserve">Toggl </w:t>
+      </w:r>
+      <w:r>
+        <w:t>після реєстрації</w:t>
+      </w:r>
+    </w:p>
+    <w:p>
+      <w:pPr>
+        <w:pStyle w:val="P"/>
+      </w:pPr>
+    </w:p>
+    <w:p>
+      <w:pPr>
+        <w:pStyle w:val="H2"/>
+      </w:pPr>
+      <w:r>
+        <w:rPr>
+          <w:lang w:val="en-US"/>
+        </w:rPr>
+        <w:t xml:space="preserve">2 </w:t>
+      </w:r>
+      <w:r>
+        <w:t>Відстеження часу</w:t>
+      </w:r>
+    </w:p>
+    <w:p>
+      <w:pPr>
+        <w:pStyle w:val="P"/>
+        <w:rPr>
+          <w:lang w:val="en-US"/>
+        </w:rPr>
+      </w:pPr>
+    </w:p>
+    <w:p>
+      <w:pPr>
+        <w:pStyle w:val="P"/>
+      </w:pPr>
+      <w:r>
+        <w:t xml:space="preserve">Система </w:t>
+      </w:r>
+      <w:r>
+        <w:rPr>
+          <w:lang w:val="en-US"/>
+        </w:rPr>
+        <w:t xml:space="preserve">Toggl </w:t>
+      </w:r>
+      <w:r>
+        <w:t xml:space="preserve">має розділення на проєкти (Англійське </w:t>
+      </w:r>
+      <w:r>
+        <w:rPr>
+          <w:i/>
+          <w:iCs/>
+          <w:lang w:val="en-US"/>
+        </w:rPr>
+        <w:t>projects</w:t>
+      </w:r>
+      <w:r>
+        <w:rPr>
+          <w:lang w:val="en-US"/>
+        </w:rPr>
+        <w:t xml:space="preserve">), </w:t>
+      </w:r>
+      <w:r>
+        <w:t xml:space="preserve">в рамках яких можна виконувати завдання. </w:t>
+      </w:r>
+    </w:p>
+    <w:p>
+      <w:pPr>
+        <w:pStyle w:val="P"/>
+      </w:pPr>
+      <w:r>
+        <w:lastRenderedPageBreak/>
+        <w:t xml:space="preserve">Було створено стандартний проєкт </w:t>
+      </w:r>
+      <w:r>
+        <w:rPr>
+          <w:lang w:val="en-US"/>
+        </w:rPr>
+        <w:t>UP2</w:t>
+      </w:r>
+      <w:r>
+        <w:t xml:space="preserve">, </w:t>
+      </w:r>
+      <w:r>
+        <w:t xml:space="preserve">в якому </w:t>
+      </w:r>
+      <w:r>
+        <w:t>роз</w:t>
+      </w:r>
+      <w:r>
+        <w:t xml:space="preserve">почато завдання: </w:t>
+      </w:r>
+      <w:r>
+        <w:t>відстежува</w:t>
+      </w:r>
+      <w:r>
+        <w:t>ння</w:t>
+      </w:r>
+      <w:r>
+        <w:t xml:space="preserve"> час</w:t>
+      </w:r>
+      <w:r>
+        <w:t>у</w:t>
+      </w:r>
+      <w:r>
+        <w:t xml:space="preserve"> виконання </w:t>
+      </w:r>
+      <w:r>
+        <w:t xml:space="preserve">запустилося </w:t>
+      </w:r>
+      <w:r>
+        <w:t xml:space="preserve">автоматично. </w:t>
+      </w:r>
+    </w:p>
+    <w:p>
+      <w:pPr>
+        <w:pStyle w:val="P"/>
+      </w:pPr>
+      <w:r>
+        <w:t>Також було додано виконане завдання як приклад:</w:t>
+      </w:r>
+    </w:p>
+    <w:p>
+      <w:pPr>
+        <w:pStyle w:val="P"/>
+      </w:pPr>
+    </w:p>
+    <w:p>
+      <w:pPr>
+        <w:pStyle w:val="IMG"/>
+      </w:pPr>
+      <w:r>
+        <w:drawing>
+          <wp:inline distT="0" distB="0" distL="0" distR="0" wp14:anchorId="6325D5AA" wp14:editId="0ED7263D">
+            <wp:extent cx="5731510" cy="6047740"/>
+            <wp:effectExtent l="0" t="0" r="2540" b="0"/>
+            <wp:docPr id="1968862537" name="Рисунок 1" descr="Зображення, що містить текст, знімок екрана, програмне забезпечення, Операційна система&#10;&#10;Вміст, створений ШІ, може бути неправильним."/>
+            <wp:cNvGraphicFramePr>
+              <a:graphicFrameLocks xmlns:a="http://schemas.openxmlformats.org/drawingml/2006/main" noChangeAspect="1"/>
+            </wp:cNvGraphicFramePr>
+            <a:graphic xmlns:a="http://schemas.openxmlformats.org/drawingml/2006/main">
+              <a:graphicData uri="http://schemas.openxmlformats.org/drawingml/2006/picture">
+                <pic:pic xmlns:pic="http://schemas.openxmlformats.org/drawingml/2006/picture">
+                  <pic:nvPicPr>
+                    <pic:cNvPr id="1968862537" name="Рисунок 1" descr="Зображення, що містить текст, знімок екрана, програмне забезпечення, Операційна система&#10;&#10;Вміст, створений ШІ, може бути неправильним."/>
+                    <pic:cNvPicPr/>
+                  </pic:nvPicPr>
+                  <pic:blipFill>
+                    <a:blip r:embed="rId10"/>
+                    <a:stretch>
+                      <a:fillRect/>
+                    </a:stretch>
+                  </pic:blipFill>
+                  <pic:spPr>
+                    <a:xfrm>
+                      <a:off x="0" y="0"/>
+                      <a:ext cx="5731510" cy="6047740"/>
+                    </a:xfrm>
+                    <a:prstGeom prst="rect">
+                      <a:avLst/>
+                    </a:prstGeom>
+                  </pic:spPr>
+                </pic:pic>
+              </a:graphicData>
+            </a:graphic>
+          </wp:inline>
+        </w:drawing>
+      </w:r>
+    </w:p>
+    <w:p>
+      <w:pPr>
+        <w:pStyle w:val="IMG"/>
+      </w:pPr>
+      <w:r>
+        <w:t>Рисунок 1.</w:t>
+      </w:r>
+      <w:r>
+        <w:t>4</w:t>
+      </w:r>
+      <w:r>
+        <w:t xml:space="preserve"> – Вигляд системи після запуску відстежування часу</w:t>
+      </w:r>
+    </w:p>
+    <w:p>
+      <w:pPr>
+        <w:pStyle w:val="IMG"/>
+      </w:pPr>
+    </w:p>
+    <w:p>
+      <w:pPr>
+        <w:pStyle w:val="IMG"/>
+      </w:pPr>
+      <w:r>
+        <w:lastRenderedPageBreak/>
+        <w:drawing>
+          <wp:inline distT="0" distB="0" distL="0" distR="0" wp14:anchorId="025D4CC5" wp14:editId="7F1137A3">
+            <wp:extent cx="5731510" cy="2170430"/>
+            <wp:effectExtent l="0" t="0" r="2540" b="1270"/>
+            <wp:docPr id="1182284434" name="Рисунок 1" descr="Зображення, що містить текст, знімок екрана, Шрифт, дизайн&#10;&#10;Вміст, створений ШІ, може бути неправильним."/>
+            <wp:cNvGraphicFramePr>
+              <a:graphicFrameLocks xmlns:a="http://schemas.openxmlformats.org/drawingml/2006/main" noChangeAspect="1"/>
+            </wp:cNvGraphicFramePr>
+            <a:graphic xmlns:a="http://schemas.openxmlformats.org/drawingml/2006/main">
+              <a:graphicData uri="http://schemas.openxmlformats.org/drawingml/2006/picture">
+                <pic:pic xmlns:pic="http://schemas.openxmlformats.org/drawingml/2006/picture">
+                  <pic:nvPicPr>
+                    <pic:cNvPr id="1182284434" name="Рисунок 1" descr="Зображення, що містить текст, знімок екрана, Шрифт, дизайн&#10;&#10;Вміст, створений ШІ, може бути неправильним."/>
+                    <pic:cNvPicPr/>
+                  </pic:nvPicPr>
+                  <pic:blipFill>
+                    <a:blip r:embed="rId11"/>
+                    <a:stretch>
+                      <a:fillRect/>
+                    </a:stretch>
+                  </pic:blipFill>
+                  <pic:spPr>
+                    <a:xfrm>
+                      <a:off x="0" y="0"/>
+                      <a:ext cx="5731510" cy="2170430"/>
+                    </a:xfrm>
+                    <a:prstGeom prst="rect">
+                      <a:avLst/>
+                    </a:prstGeom>
+                  </pic:spPr>
+                </pic:pic>
+              </a:graphicData>
+            </a:graphic>
+          </wp:inline>
+        </w:drawing>
+      </w:r>
+    </w:p>
+    <w:p>
+      <w:pPr>
+        <w:pStyle w:val="IMG"/>
+      </w:pPr>
+      <w:r>
+        <w:t>Рисунок 1.</w:t>
+      </w:r>
+      <w:r>
+        <w:t>5</w:t>
+      </w:r>
+      <w:r>
+        <w:t xml:space="preserve"> – Створене завдання-приклад</w:t>
+      </w:r>
+    </w:p>
+    <w:p>
+      <w:pPr>
+        <w:pStyle w:val="P"/>
+      </w:pPr>
+    </w:p>
+    <w:p>
+      <w:pPr>
+        <w:pStyle w:val="P"/>
+      </w:pPr>
+      <w:r>
+        <w:t>Під час виконання цієї роботи таймер було запущено, в кінці було отримано такі завдання:</w:t>
+      </w:r>
+    </w:p>
+    <w:p>
+      <w:pPr>
+        <w:pStyle w:val="P"/>
+      </w:pPr>
+    </w:p>
+    <w:p>
+      <w:pPr>
+        <w:pStyle w:val="IMG"/>
+      </w:pPr>
+      <w:r>
+        <w:drawing>
+          <wp:inline distT="0" distB="0" distL="0" distR="0" wp14:anchorId="7D6F38DE" wp14:editId="1C960187">
+            <wp:extent cx="5731510" cy="3881120"/>
+            <wp:effectExtent l="0" t="0" r="2540" b="5080"/>
+            <wp:docPr id="1034835685" name="Рисунок 1" descr="Зображення, що містить текст, знімок екрана, Шрифт, число&#10;&#10;Вміст, створений ШІ, може бути неправильним."/>
+            <wp:cNvGraphicFramePr>
+              <a:graphicFrameLocks xmlns:a="http://schemas.openxmlformats.org/drawingml/2006/main" noChangeAspect="1"/>
+            </wp:cNvGraphicFramePr>
+            <a:graphic xmlns:a="http://schemas.openxmlformats.org/drawingml/2006/main">
+              <a:graphicData uri="http://schemas.openxmlformats.org/drawingml/2006/picture">
+                <pic:pic xmlns:pic="http://schemas.openxmlformats.org/drawingml/2006/picture">
+                  <pic:nvPicPr>
+                    <pic:cNvPr id="1034835685" name="Рисунок 1" descr="Зображення, що містить текст, знімок екрана, Шрифт, число&#10;&#10;Вміст, створений ШІ, може бути неправильним."/>
+                    <pic:cNvPicPr/>
+                  </pic:nvPicPr>
+                  <pic:blipFill>
+                    <a:blip r:embed="rId12"/>
+                    <a:stretch>
+                      <a:fillRect/>
+                    </a:stretch>
+                  </pic:blipFill>
+                  <pic:spPr>
+                    <a:xfrm>
+                      <a:off x="0" y="0"/>
+                      <a:ext cx="5731510" cy="3881120"/>
+                    </a:xfrm>
+                    <a:prstGeom prst="rect">
+                      <a:avLst/>
+                    </a:prstGeom>
+                  </pic:spPr>
+                </pic:pic>
+              </a:graphicData>
+            </a:graphic>
+          </wp:inline>
+        </w:drawing>
+      </w:r>
+    </w:p>
+    <w:p>
+      <w:pPr>
+        <w:pStyle w:val="IMG"/>
+      </w:pPr>
+      <w:r>
+        <w:t>Рисунок 1.</w:t>
+      </w:r>
+      <w:r>
+        <w:t>6</w:t>
+      </w:r>
+      <w:r>
+        <w:t xml:space="preserve"> – Отримані завдання та часи їх виконання після завершення роботи</w:t>
+      </w:r>
+    </w:p>
+    <w:p>
+      <w:pPr>
+        <w:pStyle w:val="P"/>
       </w:pPr>
     </w:p>
     <w:p>
@@ -551,15 +1179,13 @@
         </w:rPr>
       </w:pPr>
       <w:r>
+        <w:lastRenderedPageBreak/>
         <w:t>Питання</w:t>
       </w:r>
     </w:p>
     <w:p>
       <w:pPr>
         <w:pStyle w:val="H2"/>
-        <w:rPr>
-          <w:lang w:val="en-US"/>
-        </w:rPr>
       </w:pPr>
       <w:r>
         <w:rPr>
@@ -582,30 +1208,279 @@
     </w:p>
     <w:p>
       <w:pPr>
+        <w:pStyle w:val="P"/>
+      </w:pPr>
+    </w:p>
+    <w:p>
+      <w:pPr>
+        <w:pStyle w:val="P"/>
+      </w:pPr>
+      <w:r>
+        <w:t xml:space="preserve">Системи контролю часу можуть бути корисними для відстеження кількості часу, витраченої на </w:t>
+      </w:r>
+      <w:r>
+        <w:t>окремі</w:t>
+      </w:r>
+      <w:r>
+        <w:t xml:space="preserve"> завдання </w:t>
+      </w:r>
+      <w:r>
+        <w:t xml:space="preserve">чи </w:t>
+      </w:r>
+      <w:r>
+        <w:t xml:space="preserve">проєкти. </w:t>
+      </w:r>
+    </w:p>
+    <w:p>
+      <w:pPr>
+        <w:pStyle w:val="P"/>
+      </w:pPr>
+      <w:r>
+        <w:t xml:space="preserve">Деякі такі системи мають вбудовані додатки у інтегровані середовища розробки (Англійське </w:t>
+      </w:r>
+      <w:r>
+        <w:rPr>
+          <w:i/>
+          <w:iCs/>
+          <w:lang w:val="en-US"/>
+        </w:rPr>
+        <w:t>IDE</w:t>
+      </w:r>
+      <w:r>
+        <w:rPr>
+          <w:lang w:val="en-US"/>
+        </w:rPr>
+        <w:t>)</w:t>
+      </w:r>
+      <w:r>
+        <w:t xml:space="preserve"> і дозволяють також відстежувати кількість часу, витрачену використовуючи певну мову програмування.</w:t>
+      </w:r>
+    </w:p>
+    <w:p>
+      <w:pPr>
+        <w:pStyle w:val="P"/>
+      </w:pPr>
+      <w:r>
+        <w:t>Також системи обліку часу можна використовувати як застосунки керування завданнями.</w:t>
+      </w:r>
+    </w:p>
+    <w:p>
+      <w:pPr>
+        <w:pStyle w:val="P"/>
+      </w:pPr>
+    </w:p>
+    <w:p>
+      <w:pPr>
         <w:pStyle w:val="H2"/>
-        <w:rPr>
-          <w:lang w:val="en-US"/>
-        </w:rPr>
-      </w:pPr>
-      <w:r>
-        <w:rPr>
-          <w:lang w:val="en-US"/>
-        </w:rPr>
-        <w:t>Які функціїможутьмати системи обліку робочого часу?</w:t>
-      </w:r>
+      </w:pPr>
+      <w:r>
+        <w:rPr>
+          <w:lang w:val="en-US"/>
+        </w:rPr>
+        <w:t>Які функції</w:t>
+      </w:r>
+      <w:r>
+        <w:rPr>
+          <w:lang w:val="en-US"/>
+        </w:rPr>
+        <w:t xml:space="preserve"> </w:t>
+      </w:r>
+      <w:r>
+        <w:rPr>
+          <w:lang w:val="en-US"/>
+        </w:rPr>
+        <w:t>можуть</w:t>
+      </w:r>
+      <w:r>
+        <w:rPr>
+          <w:lang w:val="en-US"/>
+        </w:rPr>
+        <w:t xml:space="preserve"> </w:t>
+      </w:r>
+      <w:r>
+        <w:rPr>
+          <w:lang w:val="en-US"/>
+        </w:rPr>
+        <w:t>мати системи обліку робочого часу?</w:t>
+      </w:r>
+    </w:p>
+    <w:p>
+      <w:pPr>
+        <w:pStyle w:val="P"/>
+      </w:pPr>
+    </w:p>
+    <w:p>
+      <w:pPr>
+        <w:pStyle w:val="P"/>
+      </w:pPr>
+      <w:r>
+        <w:t>Основними функціями систем обліку часу є можливість додавання завдань та відстеження часу їх виконання. Для цього такі системи використовують таймери, які користувач може запустити на початку виконання завдання і закінчити після завершення.</w:t>
+      </w:r>
+    </w:p>
+    <w:p>
+      <w:pPr>
+        <w:pStyle w:val="P"/>
+      </w:pPr>
+      <w:r>
+        <w:t xml:space="preserve">Розглянута система обліку часу </w:t>
+      </w:r>
+      <w:r>
+        <w:rPr>
+          <w:lang w:val="en-US"/>
+        </w:rPr>
+        <w:t xml:space="preserve">Toggl </w:t>
+      </w:r>
+      <w:r>
+        <w:t>працює так само.</w:t>
+      </w:r>
+    </w:p>
+    <w:p>
+      <w:pPr>
+        <w:pStyle w:val="P"/>
+      </w:pPr>
     </w:p>
     <w:p>
       <w:pPr>
         <w:pStyle w:val="H2"/>
-        <w:rPr>
-          <w:lang w:val="en-US"/>
-        </w:rPr>
       </w:pPr>
       <w:r>
         <w:rPr>
           <w:lang w:val="en-US"/>
         </w:rPr>
         <w:t>Опишіть техніку управління часом Pomodoro.</w:t>
+      </w:r>
+    </w:p>
+    <w:p>
+      <w:pPr>
+        <w:pStyle w:val="P"/>
+      </w:pPr>
+    </w:p>
+    <w:p>
+      <w:pPr>
+        <w:pStyle w:val="P"/>
+      </w:pPr>
+      <w:r>
+        <w:rPr>
+          <w:lang w:val="en-US"/>
+        </w:rPr>
+        <w:t xml:space="preserve">Pomodoro </w:t>
+      </w:r>
+      <w:r>
+        <w:t>є технікою керування часом, яка розбиває роботу над завданням на коротші інтервали з різним часом відпочинку. Стандартною схемою Помодоро є</w:t>
+      </w:r>
+      <w:r>
+        <w:rPr>
+          <w:lang w:val="en-US"/>
+        </w:rPr>
+        <w:t xml:space="preserve"> 25/5 (</w:t>
+      </w:r>
+      <w:r>
+        <w:t>25 хвилин праці, 5 хвилин відпочинку)</w:t>
+      </w:r>
+      <w:r>
+        <w:t>.</w:t>
+      </w:r>
+    </w:p>
+    <w:p>
+      <w:pPr>
+        <w:pStyle w:val="P"/>
+      </w:pPr>
+      <w:r>
+        <w:t xml:space="preserve">Метод </w:t>
+      </w:r>
+      <w:r>
+        <w:t>виконується</w:t>
+      </w:r>
+      <w:r>
+        <w:t xml:space="preserve"> так</w:t>
+      </w:r>
+      <w:r>
+        <w:t>:</w:t>
+      </w:r>
+    </w:p>
+    <w:p>
+      <w:pPr>
+        <w:pStyle w:val="P"/>
+        <w:numPr>
+          <w:ilvl w:val="0"/>
+          <w:numId w:val="5"/>
+        </w:numPr>
+      </w:pPr>
+      <w:r>
+        <w:t>Запустити таймер на 25 хвилин, працювати в цей час;</w:t>
+      </w:r>
+    </w:p>
+    <w:p>
+      <w:pPr>
+        <w:pStyle w:val="P"/>
+        <w:numPr>
+          <w:ilvl w:val="0"/>
+          <w:numId w:val="5"/>
+        </w:numPr>
+      </w:pPr>
+      <w:r>
+        <w:t>Під час перерви у 5 хвилин відпочити;</w:t>
+      </w:r>
+    </w:p>
+    <w:p>
+      <w:pPr>
+        <w:pStyle w:val="P"/>
+        <w:numPr>
+          <w:ilvl w:val="0"/>
+          <w:numId w:val="5"/>
+        </w:numPr>
+      </w:pPr>
+      <w:r>
+        <w:t>Продовжити працювати, зазвичай 4 таких цикли</w:t>
+      </w:r>
+      <w:r>
+        <w:t>;</w:t>
+      </w:r>
+    </w:p>
+    <w:p>
+      <w:pPr>
+        <w:pStyle w:val="P"/>
+        <w:numPr>
+          <w:ilvl w:val="0"/>
+          <w:numId w:val="5"/>
+        </w:numPr>
+      </w:pPr>
+      <w:r>
+        <w:lastRenderedPageBreak/>
+        <w:t>Після четвертого циклу взяти довшу перерву, зазвичай 20 хвилин.</w:t>
+      </w:r>
+    </w:p>
+    <w:p>
+      <w:pPr>
+        <w:pStyle w:val="P"/>
+      </w:pPr>
+      <w:r>
+        <w:t xml:space="preserve">Джерело: </w:t>
+      </w:r>
+      <w:hyperlink r:id="rId13" w:history="1">
+        <w:r>
+          <w:rPr>
+            <w:rStyle w:val="a4"/>
+            <w:lang w:val="en-US"/>
+          </w:rPr>
+          <w:t>Pomodoro Technique –</w:t>
+        </w:r>
+        <w:r>
+          <w:rPr>
+            <w:rStyle w:val="a4"/>
+          </w:rPr>
+          <w:t xml:space="preserve"> </w:t>
+        </w:r>
+        <w:r>
+          <w:rPr>
+            <w:rStyle w:val="a4"/>
+            <w:lang w:val="en-US"/>
+          </w:rPr>
+          <w:t>Wikipedia</w:t>
+        </w:r>
+      </w:hyperlink>
+      <w:r>
+        <w:t>.</w:t>
       </w:r>
     </w:p>
     <w:sectPr>
@@ -710,6 +1585,95 @@
     </w:lvl>
   </w:abstractNum>
   <w:abstractNum w:abstractNumId="1" w15:restartNumberingAfterBreak="0">
+    <w:nsid w:val="38EB586A"/>
+    <w:multiLevelType w:val="hybridMultilevel"/>
+    <w:tmpl w:val="6D06EB12"/>
+    <w:lvl w:ilvl="0" w:tplc="C13CB4E0">
+      <w:start w:val="1"/>
+      <w:numFmt w:val="decimal"/>
+      <w:lvlText w:val="%1."/>
+      <w:lvlJc w:val="left"/>
+      <w:pPr>
+        <w:ind w:left="1211" w:hanging="360"/>
+      </w:pPr>
+      <w:rPr>
+        <w:rFonts w:hint="default"/>
+      </w:rPr>
+    </w:lvl>
+    <w:lvl w:ilvl="1" w:tplc="04220019" w:tentative="1">
+      <w:start w:val="1"/>
+      <w:numFmt w:val="lowerLetter"/>
+      <w:lvlText w:val="%2."/>
+      <w:lvlJc w:val="left"/>
+      <w:pPr>
+        <w:ind w:left="1931" w:hanging="360"/>
+      </w:pPr>
+    </w:lvl>
+    <w:lvl w:ilvl="2" w:tplc="0422001B" w:tentative="1">
+      <w:start w:val="1"/>
+      <w:numFmt w:val="lowerRoman"/>
+      <w:lvlText w:val="%3."/>
+      <w:lvlJc w:val="right"/>
+      <w:pPr>
+        <w:ind w:left="2651" w:hanging="180"/>
+      </w:pPr>
+    </w:lvl>
+    <w:lvl w:ilvl="3" w:tplc="0422000F" w:tentative="1">
+      <w:start w:val="1"/>
+      <w:numFmt w:val="decimal"/>
+      <w:lvlText w:val="%4."/>
+      <w:lvlJc w:val="left"/>
+      <w:pPr>
+        <w:ind w:left="3371" w:hanging="360"/>
+      </w:pPr>
+    </w:lvl>
+    <w:lvl w:ilvl="4" w:tplc="04220019" w:tentative="1">
+      <w:start w:val="1"/>
+      <w:numFmt w:val="lowerLetter"/>
+      <w:lvlText w:val="%5."/>
+      <w:lvlJc w:val="left"/>
+      <w:pPr>
+        <w:ind w:left="4091" w:hanging="360"/>
+      </w:pPr>
+    </w:lvl>
+    <w:lvl w:ilvl="5" w:tplc="0422001B" w:tentative="1">
+      <w:start w:val="1"/>
+      <w:numFmt w:val="lowerRoman"/>
+      <w:lvlText w:val="%6."/>
+      <w:lvlJc w:val="right"/>
+      <w:pPr>
+        <w:ind w:left="4811" w:hanging="180"/>
+      </w:pPr>
+    </w:lvl>
+    <w:lvl w:ilvl="6" w:tplc="0422000F" w:tentative="1">
+      <w:start w:val="1"/>
+      <w:numFmt w:val="decimal"/>
+      <w:lvlText w:val="%7."/>
+      <w:lvlJc w:val="left"/>
+      <w:pPr>
+        <w:ind w:left="5531" w:hanging="360"/>
+      </w:pPr>
+    </w:lvl>
+    <w:lvl w:ilvl="7" w:tplc="04220019" w:tentative="1">
+      <w:start w:val="1"/>
+      <w:numFmt w:val="lowerLetter"/>
+      <w:lvlText w:val="%8."/>
+      <w:lvlJc w:val="left"/>
+      <w:pPr>
+        <w:ind w:left="6251" w:hanging="360"/>
+      </w:pPr>
+    </w:lvl>
+    <w:lvl w:ilvl="8" w:tplc="0422001B" w:tentative="1">
+      <w:start w:val="1"/>
+      <w:numFmt w:val="lowerRoman"/>
+      <w:lvlText w:val="%9."/>
+      <w:lvlJc w:val="right"/>
+      <w:pPr>
+        <w:ind w:left="6971" w:hanging="180"/>
+      </w:pPr>
+    </w:lvl>
+  </w:abstractNum>
+  <w:abstractNum w:abstractNumId="2" w15:restartNumberingAfterBreak="0">
     <w:nsid w:val="48EC40D5"/>
     <w:multiLevelType w:val="hybridMultilevel"/>
     <w:tmpl w:val="A5867A56"/>
@@ -798,7 +1762,7 @@
       </w:pPr>
     </w:lvl>
   </w:abstractNum>
-  <w:abstractNum w:abstractNumId="2" w15:restartNumberingAfterBreak="0">
+  <w:abstractNum w:abstractNumId="3" w15:restartNumberingAfterBreak="0">
     <w:nsid w:val="748903EC"/>
     <w:multiLevelType w:val="hybridMultilevel"/>
     <w:tmpl w:val="33A80580"/>
@@ -887,7 +1851,7 @@
       </w:pPr>
     </w:lvl>
   </w:abstractNum>
-  <w:abstractNum w:abstractNumId="3" w15:restartNumberingAfterBreak="0">
+  <w:abstractNum w:abstractNumId="4" w15:restartNumberingAfterBreak="0">
     <w:nsid w:val="795D4379"/>
     <w:multiLevelType w:val="hybridMultilevel"/>
     <w:tmpl w:val="C21A163C"/>
@@ -1000,15 +1964,18 @@
     </w:lvl>
   </w:abstractNum>
   <w:num w:numId="1" w16cid:durableId="1471048762">
-    <w:abstractNumId w:val="3"/>
+    <w:abstractNumId w:val="4"/>
   </w:num>
   <w:num w:numId="2" w16cid:durableId="2123066900">
     <w:abstractNumId w:val="0"/>
   </w:num>
   <w:num w:numId="3" w16cid:durableId="343481994">
+    <w:abstractNumId w:val="3"/>
+  </w:num>
+  <w:num w:numId="4" w16cid:durableId="730664261">
     <w:abstractNumId w:val="2"/>
   </w:num>
-  <w:num w:numId="4" w16cid:durableId="730664261">
+  <w:num w:numId="5" w16cid:durableId="437212661">
     <w:abstractNumId w:val="1"/>
   </w:num>
 </w:numbering>
@@ -1484,7 +2451,6 @@
   <w:style w:type="character" w:default="1" w:styleId="a0">
     <w:name w:val="Default Paragraph Font"/>
     <w:uiPriority w:val="1"/>
-    <w:semiHidden/>
     <w:unhideWhenUsed/>
   </w:style>
   <w:style w:type="table" w:default="1" w:styleId="a1">

</xml_diff>